<commit_message>
Update Reactive Literature: corpus now 2,044 (post CV-audit ingestion); refresh PDF/docx
Co-Authored-By: Claude Opus 4.8 <noreply@anthropic.com>
</commit_message>
<xml_diff>
--- a/papers/Gerszten-Reactive-Literature.docx
+++ b/papers/Gerszten-Reactive-Literature.docx
@@ -106,7 +106,7 @@
           <w:sz w:val="21"/>
           <w:szCs w:val="21"/>
         </w:rPr>
-        <w:t xml:space="preserve">Does legal scholarship on bank regulation influence policy, or merely comment on it? This paper assembles an original corpus of 1,915 banking-law review articles (2000–2025) and links it to the federal policy record through free government data, in order to measure influence rather than assume it. The answer is stratified. In the aggregate, the literature is reactive: scholarly output tracks policy events at a two-to-three-year lag, and the topics that dominate the field—Dodd-Frank, crisis programs, Basel III—surge after the events that produced them, not before. But a small, identifiable vanguard sits upstream of policy, and its influence is visible across three independent channels: citation of specific articles in congressional and judicial documents, recurring expert testimony, and movement into government office. The paper documents both the reactive baseline and the upstream exceptions, develops a reproducible and license-respecting method for the linkage, and is deliberate about what “influence” can and cannot be shown. A companion interactive dashboard and a Bluebook-formatted citation dataset accompany the study.</w:t>
+        <w:t xml:space="preserve">Does legal scholarship on bank regulation influence policy, or merely comment on it? This paper assembles an original corpus of 2,044 banking-law review articles (2000–2025) and links it to the federal policy record through free government data, in order to measure influence rather than assume it. The answer is stratified. In the aggregate, the literature is reactive: scholarly output tracks policy events at a two-to-three-year lag, and the topics that dominate the field—Dodd-Frank, crisis programs, Basel III—surge after the events that produced them, not before. But a small, identifiable vanguard sits upstream of policy, and its influence is visible across three independent channels: citation of specific articles in congressional and judicial documents, recurring expert testimony, and movement into government office. The paper documents both the reactive baseline and the upstream exceptions, develops a reproducible and license-respecting method for the linkage, and is deliberate about what “influence” can and cannot be shown. A companion interactive dashboard and a Bluebook-formatted citation dataset accompany the study.</w:t>
       </w:r>
     </w:p>
     <w:p>
@@ -294,7 +294,7 @@
           <w:i w:val="false"/>
           <w:iCs w:val="false"/>
         </w:rPr>
-        <w:t xml:space="preserve">The corpus comprises 1,915 banking-relevant articles published 2000–2025, filtered from roughly 8,400 deduplicated law-review records drawn from some 384 sources. The records were assembled exclusively from </w:t>
+        <w:t xml:space="preserve">The corpus comprises 2,044 banking-relevant articles published 2000–2025, filtered from roughly 8,500 deduplicated law-review records drawn from some 384 sources. The records were assembled exclusively from </w:t>
       </w:r>
       <w:r>
         <w:rPr>
@@ -450,7 +450,7 @@
           <w:i w:val="false"/>
           <w:iCs w:val="false"/>
         </w:rPr>
-        <w:t xml:space="preserve">: every record carries a citation built from its journal of record—never SSRN or a repository. Of 1,915 records, 1,326 (69%) have a complete citation (author, title, volume, journal, first page, year); 341 have a known journal but pending volume or page; and 248 (13%) are flagged for manual completion because their published venue cannot be recovered from open sources alone. Flagging the residual, rather than mislabeling it, keeps the dataset honest.</w:t>
+        <w:t xml:space="preserve">: every record carries a citation built from its journal of record—never SSRN or a repository. Of 2,044 records, 1,329 (69%) have a complete citation (author, title, volume, journal, first page, year); 341 have a known journal but pending volume or page; and 224 (11%) are flagged for manual completion because their published venue cannot be recovered from open sources alone. Flagging the residual, rather than mislabeling it, keeps the dataset honest.</w:t>
       </w:r>
     </w:p>
     <w:p>
@@ -1838,7 +1838,7 @@
           <w:i/>
           <w:iCs/>
         </w:rPr>
-        <w:t xml:space="preserve">Twelve of seventeen</w:t>
+        <w:t xml:space="preserve">Thirteen of eighteen</w:t>
       </w:r>
       <w:r>
         <w:rPr>
@@ -1871,7 +1871,7 @@
           <w:i w:val="false"/>
           <w:iCs w:val="false"/>
         </w:rPr>
-        <w:t xml:space="preserve"> (r ≈ 0.43): scholarly output correlates most strongly with the policy events of two to three years earlier. Both analyses point the same way. In the aggregate, the literature follows policy.</w:t>
+        <w:t xml:space="preserve"> (r ≈ 0.44): scholarly output correlates most strongly with the policy events of two to three years earlier. Both analyses point the same way. In the aggregate, the literature follows policy.</w:t>
       </w:r>
     </w:p>
     <w:p>
@@ -2489,7 +2489,7 @@
           <w:i w:val="false"/>
           <w:iCs w:val="false"/>
         </w:rPr>
-        <w:t xml:space="preserve"> Approximately 1,915 banking-relevant articles (2000–2025), a 30-topic taxonomy, and 1,477 authors, assembled from open, terms-of-service-respecting sources only. </w:t>
+        <w:t xml:space="preserve"> Approximately 2,044 banking-relevant articles (2000–2025), a 30-topic taxonomy, and 1,477 authors, assembled from open, terms-of-service-respecting sources only. </w:t>
       </w:r>
       <w:r>
         <w:rPr>
@@ -2503,7 +2503,7 @@
           <w:i w:val="false"/>
           <w:iCs w:val="false"/>
         </w:rPr>
-        <w:t xml:space="preserve"> 1,326 complete citations, 341 journal-only, and 248 flagged for manual completion; the journal of record is never SSRN or a repository. </w:t>
+        <w:t xml:space="preserve"> 1,329 complete citations, 491 journal-only, and 224 flagged for manual completion; the journal of record is never SSRN or a repository. </w:t>
       </w:r>
       <w:r>
         <w:rPr>

</xml_diff>